<commit_message>
Update DAW: enhanced UI, loop sync, and functionality
</commit_message>
<xml_diff>
--- a/Team Artifacts/fruitytech-studio_living_document.docx
+++ b/Team Artifacts/fruitytech-studio_living_document.docx
@@ -720,7 +720,7 @@
           <w:color w:val="273540"/>
           <w:rtl w:val="0"/>
         </w:rPr>
-        <w:t xml:space="preserve">Use case 1: Create a music loop using sound objects</w:t>
+        <w:t xml:space="preserve">Use case 1: Create a music loop using interface (buttons, piano roll) and sound objects </w:t>
       </w:r>
     </w:p>
     <w:p>
@@ -835,7 +835,7 @@
           <w:color w:val="273540"/>
           <w:rtl w:val="0"/>
         </w:rPr>
-        <w:t xml:space="preserve">The user opens FruityTech Studio and chooses to start a new sandbox.</w:t>
+        <w:t xml:space="preserve">The user opens FruityTech Studio app with working interface</w:t>
       </w:r>
     </w:p>
     <w:p>
@@ -1065,7 +1065,30 @@
           <w:color w:val="273540"/>
           <w:rtl w:val="0"/>
         </w:rPr>
-        <w:t xml:space="preserve">The user may continue editing, save, or stop playback.</w:t>
+        <w:t xml:space="preserve">The user may continue editing, loopback, undo or stop playback.</w:t>
+      </w:r>
+    </w:p>
+    <w:p>
+      <w:pPr>
+        <w:numPr>
+          <w:ilvl w:val="1"/>
+          <w:numId w:val="29"/>
+        </w:numPr>
+        <w:spacing w:after="0" w:afterAutospacing="0" w:line="276" w:lineRule="auto"/>
+        <w:ind w:left="1440" w:hanging="360"/>
+        <w:rPr>
+          <w:rFonts w:ascii="Times New Roman" w:cs="Times New Roman" w:eastAsia="Times New Roman" w:hAnsi="Times New Roman"/>
+          <w:color w:val="273540"/>
+          <w:u w:val="none"/>
+        </w:rPr>
+      </w:pPr>
+      <w:r>
+        <w:rPr>
+          <w:rFonts w:ascii="Times New Roman" w:cs="Times New Roman" w:eastAsia="Times New Roman" w:hAnsi="Times New Roman"/>
+          <w:color w:val="273540"/>
+          <w:rtl w:val="0"/>
+        </w:rPr>
+        <w:t xml:space="preserve">The sound objects can be removed by clicking on them</w:t>
       </w:r>
     </w:p>
     <w:p>
@@ -1111,7 +1134,7 @@
           <w:color w:val="273540"/>
           <w:rtl w:val="0"/>
         </w:rPr>
-        <w:t xml:space="preserve">The user opens FruityTech Studio and chooses to start a new sandbox.</w:t>
+        <w:t xml:space="preserve">The user opens FruityTech Studio app.</w:t>
       </w:r>
     </w:p>
     <w:p>
@@ -1134,7 +1157,7 @@
           <w:color w:val="273540"/>
           <w:rtl w:val="0"/>
         </w:rPr>
-        <w:t xml:space="preserve">The system displays the interactive 2D sandbox with available sound objects.</w:t>
+        <w:t xml:space="preserve">The system displays the main screen with piano roll, instruments and top bar.</w:t>
       </w:r>
     </w:p>
     <w:p>
@@ -1157,7 +1180,7 @@
           <w:color w:val="273540"/>
           <w:rtl w:val="0"/>
         </w:rPr>
-        <w:t xml:space="preserve">The user selects and places a sound object from the sound selection list.</w:t>
+        <w:t xml:space="preserve">The user selects and places a sound object from the sound selection list (demo only piano)</w:t>
       </w:r>
     </w:p>
     <w:p>
@@ -1209,6 +1232,75 @@
     <w:p>
       <w:pPr>
         <w:numPr>
+          <w:ilvl w:val="1"/>
+          <w:numId w:val="29"/>
+        </w:numPr>
+        <w:spacing w:after="0" w:afterAutospacing="0" w:line="276" w:lineRule="auto"/>
+        <w:ind w:left="1440" w:hanging="360"/>
+        <w:rPr>
+          <w:rFonts w:ascii="Times New Roman" w:cs="Times New Roman" w:eastAsia="Times New Roman" w:hAnsi="Times New Roman"/>
+          <w:color w:val="273540"/>
+          <w:u w:val="none"/>
+        </w:rPr>
+      </w:pPr>
+      <w:r>
+        <w:rPr>
+          <w:rFonts w:ascii="Times New Roman" w:cs="Times New Roman" w:eastAsia="Times New Roman" w:hAnsi="Times New Roman"/>
+          <w:color w:val="273540"/>
+          <w:rtl w:val="0"/>
+        </w:rPr>
+        <w:t xml:space="preserve">Play/Stop buttons are working </w:t>
+      </w:r>
+    </w:p>
+    <w:p>
+      <w:pPr>
+        <w:numPr>
+          <w:ilvl w:val="1"/>
+          <w:numId w:val="29"/>
+        </w:numPr>
+        <w:spacing w:after="0" w:afterAutospacing="0" w:line="276" w:lineRule="auto"/>
+        <w:ind w:left="1440" w:hanging="360"/>
+        <w:rPr>
+          <w:rFonts w:ascii="Times New Roman" w:cs="Times New Roman" w:eastAsia="Times New Roman" w:hAnsi="Times New Roman"/>
+          <w:color w:val="273540"/>
+          <w:u w:val="none"/>
+        </w:rPr>
+      </w:pPr>
+      <w:r>
+        <w:rPr>
+          <w:rFonts w:ascii="Times New Roman" w:cs="Times New Roman" w:eastAsia="Times New Roman" w:hAnsi="Times New Roman"/>
+          <w:color w:val="273540"/>
+          <w:rtl w:val="0"/>
+        </w:rPr>
+        <w:t xml:space="preserve">Loopback moves playhead at the start while loop is active </w:t>
+      </w:r>
+    </w:p>
+    <w:p>
+      <w:pPr>
+        <w:numPr>
+          <w:ilvl w:val="1"/>
+          <w:numId w:val="29"/>
+        </w:numPr>
+        <w:spacing w:after="0" w:afterAutospacing="0" w:line="276" w:lineRule="auto"/>
+        <w:ind w:left="1440" w:hanging="360"/>
+        <w:rPr>
+          <w:rFonts w:ascii="Times New Roman" w:cs="Times New Roman" w:eastAsia="Times New Roman" w:hAnsi="Times New Roman"/>
+          <w:color w:val="273540"/>
+          <w:u w:val="none"/>
+        </w:rPr>
+      </w:pPr>
+      <w:r>
+        <w:rPr>
+          <w:rFonts w:ascii="Times New Roman" w:cs="Times New Roman" w:eastAsia="Times New Roman" w:hAnsi="Times New Roman"/>
+          <w:color w:val="273540"/>
+          <w:rtl w:val="0"/>
+        </w:rPr>
+        <w:t xml:space="preserve">Undo reverse last action</w:t>
+      </w:r>
+    </w:p>
+    <w:p>
+      <w:pPr>
+        <w:numPr>
           <w:ilvl w:val="0"/>
           <w:numId w:val="29"/>
         </w:numPr>
@@ -1327,52 +1419,6 @@
           <w:ilvl w:val="2"/>
           <w:numId w:val="29"/>
         </w:numPr>
-        <w:spacing w:after="0" w:afterAutospacing="0" w:line="276" w:lineRule="auto"/>
-        <w:ind w:left="2160" w:hanging="360"/>
-        <w:rPr>
-          <w:rFonts w:ascii="Times New Roman" w:cs="Times New Roman" w:eastAsia="Times New Roman" w:hAnsi="Times New Roman"/>
-          <w:color w:val="273540"/>
-          <w:u w:val="none"/>
-        </w:rPr>
-      </w:pPr>
-      <w:r>
-        <w:rPr>
-          <w:rFonts w:ascii="Times New Roman" w:cs="Times New Roman" w:eastAsia="Times New Roman" w:hAnsi="Times New Roman"/>
-          <w:color w:val="273540"/>
-          <w:rtl w:val="0"/>
-        </w:rPr>
-        <w:t xml:space="preserve">System response: The placement is rejected and notifies the user.</w:t>
-      </w:r>
-    </w:p>
-    <w:p>
-      <w:pPr>
-        <w:numPr>
-          <w:ilvl w:val="1"/>
-          <w:numId w:val="29"/>
-        </w:numPr>
-        <w:spacing w:after="0" w:afterAutospacing="0" w:line="276" w:lineRule="auto"/>
-        <w:ind w:left="1440" w:hanging="360"/>
-        <w:rPr>
-          <w:rFonts w:ascii="Times New Roman" w:cs="Times New Roman" w:eastAsia="Times New Roman" w:hAnsi="Times New Roman"/>
-          <w:color w:val="273540"/>
-          <w:u w:val="none"/>
-        </w:rPr>
-      </w:pPr>
-      <w:r>
-        <w:rPr>
-          <w:rFonts w:ascii="Times New Roman" w:cs="Times New Roman" w:eastAsia="Times New Roman" w:hAnsi="Times New Roman"/>
-          <w:color w:val="273540"/>
-          <w:rtl w:val="0"/>
-        </w:rPr>
-        <w:t xml:space="preserve">A sound object fails to load or schedule correctly.</w:t>
-      </w:r>
-    </w:p>
-    <w:p>
-      <w:pPr>
-        <w:numPr>
-          <w:ilvl w:val="2"/>
-          <w:numId w:val="29"/>
-        </w:numPr>
         <w:spacing w:after="100" w:line="276" w:lineRule="auto"/>
         <w:ind w:left="2160" w:hanging="360"/>
         <w:rPr>
@@ -1387,7 +1433,7 @@
           <w:color w:val="273540"/>
           <w:rtl w:val="0"/>
         </w:rPr>
-        <w:t xml:space="preserve">System response: The system prevents playback of that object and notifies the user.</w:t>
+        <w:t xml:space="preserve">Selection will be ignored by the program. The working grid is explicitly shown in the UI.</w:t>
       </w:r>
     </w:p>
     <w:p>

</xml_diff>